<commit_message>
method numbers were swithed relative to the online version of the exercices
</commit_message>
<xml_diff>
--- a/2026/week01/installation/deactivating-ai/IntelliJ_IDEA_desactiver_ai_assistant.docx
+++ b/2026/week01/installation/deactivating-ai/IntelliJ_IDEA_desactiver_ai_assistant.docx
@@ -22,17 +22,6 @@
       <w:proofErr w:type="spellEnd"/>
       <w:r>
         <w:t xml:space="preserve"> IDEA</w:t>
-      </w:r>
-      <w:r>
-        <w:t xml:space="preserve"> (</w:t>
-      </w:r>
-      <w:proofErr w:type="spellStart"/>
-      <w:r>
-        <w:t>MacOS</w:t>
-      </w:r>
-      <w:proofErr w:type="spellEnd"/>
-      <w:r>
-        <w:t>)</w:t>
       </w:r>
     </w:p>
     <w:p>

</xml_diff>